<commit_message>
Material and Methods part 1 (incomplete)
some information about Corpas family and the pedigree
</commit_message>
<xml_diff>
--- a/report_G5.docx
+++ b/report_G5.docx
@@ -222,7 +222,7 @@
       </w:r>
     </w:p>
     <w:bookmarkEnd w:id="12"/>
-    <w:bookmarkStart w:id="16" w:name="materials-and-methods"/>
+    <w:bookmarkStart w:id="19" w:name="materials-and-methods"/>
     <w:p>
       <w:pPr>
         <w:pStyle w:val="Heading2"/>
@@ -231,7 +231,766 @@
         <w:t xml:space="preserve">Materials and methods</w:t>
       </w:r>
     </w:p>
-    <w:bookmarkStart w:id="13" w:name="study-participantswhole-exome-sequencing"/>
+    <w:p>
+      <w:pPr>
+        <w:pStyle w:val="FirstParagraph"/>
+      </w:pPr>
+      <w:r>
+        <w:t xml:space="preserve">The base of our work is publicly available genetic data from a Spanish family, consisting of a father, mother and their daughter, referred to as</w:t>
+      </w:r>
+      <w:r>
+        <w:t xml:space="preserve"> </w:t>
+      </w:r>
+      <w:r>
+        <w:t xml:space="preserve">“the Corpasome”</w:t>
+      </w:r>
+      <w:r>
+        <w:rPr>
+          <w:vertAlign w:val="superscript"/>
+        </w:rPr>
+        <w:t xml:space="preserve">1</w:t>
+      </w:r>
+      <w:r>
+        <w:t xml:space="preserve">. In our case the genome of the daughter is synthetically altered and a disease phenotype, caused by these alterations, is described. The parental sequencing reads remain unaltered and their phenotype is unremarkable.</w:t>
+      </w:r>
+    </w:p>
+    <w:p>
+      <w:pPr>
+        <w:pStyle w:val="SourceCode"/>
+      </w:pPr>
+      <w:r>
+        <w:rPr>
+          <w:rStyle w:val="CommentTok"/>
+        </w:rPr>
+        <w:t xml:space="preserve">#pedigree</w:t>
+      </w:r>
+      <w:r>
+        <w:br/>
+      </w:r>
+      <w:r>
+        <w:br/>
+      </w:r>
+      <w:r>
+        <w:rPr>
+          <w:rStyle w:val="FunctionTok"/>
+        </w:rPr>
+        <w:t xml:space="preserve">library</w:t>
+      </w:r>
+      <w:r>
+        <w:rPr>
+          <w:rStyle w:val="NormalTok"/>
+        </w:rPr>
+        <w:t xml:space="preserve">(kinship2)</w:t>
+      </w:r>
+      <w:r>
+        <w:br/>
+      </w:r>
+      <w:r>
+        <w:br/>
+      </w:r>
+      <w:r>
+        <w:rPr>
+          <w:rStyle w:val="NormalTok"/>
+        </w:rPr>
+        <w:t xml:space="preserve">ped </w:t>
+      </w:r>
+      <w:r>
+        <w:rPr>
+          <w:rStyle w:val="OtherTok"/>
+        </w:rPr>
+        <w:t xml:space="preserve">&lt;-</w:t>
+      </w:r>
+      <w:r>
+        <w:rPr>
+          <w:rStyle w:val="NormalTok"/>
+        </w:rPr>
+        <w:t xml:space="preserve"> </w:t>
+      </w:r>
+      <w:r>
+        <w:rPr>
+          <w:rStyle w:val="FunctionTok"/>
+        </w:rPr>
+        <w:t xml:space="preserve">read_table</w:t>
+      </w:r>
+      <w:r>
+        <w:rPr>
+          <w:rStyle w:val="NormalTok"/>
+        </w:rPr>
+        <w:t xml:space="preserve">(</w:t>
+      </w:r>
+      <w:r>
+        <w:rPr>
+          <w:rStyle w:val="StringTok"/>
+        </w:rPr>
+        <w:t xml:space="preserve">"data/corpasome.ped"</w:t>
+      </w:r>
+      <w:r>
+        <w:rPr>
+          <w:rStyle w:val="NormalTok"/>
+        </w:rPr>
+        <w:t xml:space="preserve">,</w:t>
+      </w:r>
+      <w:r>
+        <w:br/>
+      </w:r>
+      <w:r>
+        <w:rPr>
+          <w:rStyle w:val="NormalTok"/>
+        </w:rPr>
+        <w:t xml:space="preserve">                  </w:t>
+      </w:r>
+      <w:r>
+        <w:rPr>
+          <w:rStyle w:val="AttributeTok"/>
+        </w:rPr>
+        <w:t xml:space="preserve">col_names =</w:t>
+      </w:r>
+      <w:r>
+        <w:rPr>
+          <w:rStyle w:val="NormalTok"/>
+        </w:rPr>
+        <w:t xml:space="preserve"> </w:t>
+      </w:r>
+      <w:r>
+        <w:rPr>
+          <w:rStyle w:val="FunctionTok"/>
+        </w:rPr>
+        <w:t xml:space="preserve">c</w:t>
+      </w:r>
+      <w:r>
+        <w:rPr>
+          <w:rStyle w:val="NormalTok"/>
+        </w:rPr>
+        <w:t xml:space="preserve">(</w:t>
+      </w:r>
+      <w:r>
+        <w:rPr>
+          <w:rStyle w:val="StringTok"/>
+        </w:rPr>
+        <w:t xml:space="preserve">"family"</w:t>
+      </w:r>
+      <w:r>
+        <w:rPr>
+          <w:rStyle w:val="NormalTok"/>
+        </w:rPr>
+        <w:t xml:space="preserve">, </w:t>
+      </w:r>
+      <w:r>
+        <w:rPr>
+          <w:rStyle w:val="StringTok"/>
+        </w:rPr>
+        <w:t xml:space="preserve">"id"</w:t>
+      </w:r>
+      <w:r>
+        <w:rPr>
+          <w:rStyle w:val="NormalTok"/>
+        </w:rPr>
+        <w:t xml:space="preserve">, </w:t>
+      </w:r>
+      <w:r>
+        <w:rPr>
+          <w:rStyle w:val="StringTok"/>
+        </w:rPr>
+        <w:t xml:space="preserve">"father"</w:t>
+      </w:r>
+      <w:r>
+        <w:rPr>
+          <w:rStyle w:val="NormalTok"/>
+        </w:rPr>
+        <w:t xml:space="preserve">, </w:t>
+      </w:r>
+      <w:r>
+        <w:rPr>
+          <w:rStyle w:val="StringTok"/>
+        </w:rPr>
+        <w:t xml:space="preserve">"mother"</w:t>
+      </w:r>
+      <w:r>
+        <w:rPr>
+          <w:rStyle w:val="NormalTok"/>
+        </w:rPr>
+        <w:t xml:space="preserve">, </w:t>
+      </w:r>
+      <w:r>
+        <w:rPr>
+          <w:rStyle w:val="StringTok"/>
+        </w:rPr>
+        <w:t xml:space="preserve">"sex"</w:t>
+      </w:r>
+      <w:r>
+        <w:rPr>
+          <w:rStyle w:val="NormalTok"/>
+        </w:rPr>
+        <w:t xml:space="preserve">, </w:t>
+      </w:r>
+      <w:r>
+        <w:rPr>
+          <w:rStyle w:val="StringTok"/>
+        </w:rPr>
+        <w:t xml:space="preserve">"phenotype"</w:t>
+      </w:r>
+      <w:r>
+        <w:rPr>
+          <w:rStyle w:val="NormalTok"/>
+        </w:rPr>
+        <w:t xml:space="preserve">),</w:t>
+      </w:r>
+      <w:r>
+        <w:br/>
+      </w:r>
+      <w:r>
+        <w:rPr>
+          <w:rStyle w:val="NormalTok"/>
+        </w:rPr>
+        <w:t xml:space="preserve">                  </w:t>
+      </w:r>
+      <w:r>
+        <w:rPr>
+          <w:rStyle w:val="AttributeTok"/>
+        </w:rPr>
+        <w:t xml:space="preserve">col_types =</w:t>
+      </w:r>
+      <w:r>
+        <w:rPr>
+          <w:rStyle w:val="NormalTok"/>
+        </w:rPr>
+        <w:t xml:space="preserve"> </w:t>
+      </w:r>
+      <w:r>
+        <w:rPr>
+          <w:rStyle w:val="StringTok"/>
+        </w:rPr>
+        <w:t xml:space="preserve">"ccccii"</w:t>
+      </w:r>
+      <w:r>
+        <w:rPr>
+          <w:rStyle w:val="NormalTok"/>
+        </w:rPr>
+        <w:t xml:space="preserve">)</w:t>
+      </w:r>
+      <w:r>
+        <w:br/>
+      </w:r>
+      <w:r>
+        <w:br/>
+      </w:r>
+      <w:r>
+        <w:rPr>
+          <w:rStyle w:val="NormalTok"/>
+        </w:rPr>
+        <w:t xml:space="preserve">ped2 </w:t>
+      </w:r>
+      <w:r>
+        <w:rPr>
+          <w:rStyle w:val="OtherTok"/>
+        </w:rPr>
+        <w:t xml:space="preserve">&lt;-</w:t>
+      </w:r>
+      <w:r>
+        <w:rPr>
+          <w:rStyle w:val="NormalTok"/>
+        </w:rPr>
+        <w:t xml:space="preserve"> ped </w:t>
+      </w:r>
+      <w:r>
+        <w:rPr>
+          <w:rStyle w:val="SpecialCharTok"/>
+        </w:rPr>
+        <w:t xml:space="preserve">|&gt;</w:t>
+      </w:r>
+      <w:r>
+        <w:br/>
+      </w:r>
+      <w:r>
+        <w:rPr>
+          <w:rStyle w:val="NormalTok"/>
+        </w:rPr>
+        <w:t xml:space="preserve">  </w:t>
+      </w:r>
+      <w:r>
+        <w:rPr>
+          <w:rStyle w:val="FunctionTok"/>
+        </w:rPr>
+        <w:t xml:space="preserve">mutate</w:t>
+      </w:r>
+      <w:r>
+        <w:rPr>
+          <w:rStyle w:val="NormalTok"/>
+        </w:rPr>
+        <w:t xml:space="preserve">(</w:t>
+      </w:r>
+      <w:r>
+        <w:rPr>
+          <w:rStyle w:val="FunctionTok"/>
+        </w:rPr>
+        <w:t xml:space="preserve">across</w:t>
+      </w:r>
+      <w:r>
+        <w:rPr>
+          <w:rStyle w:val="NormalTok"/>
+        </w:rPr>
+        <w:t xml:space="preserve">(</w:t>
+      </w:r>
+      <w:r>
+        <w:rPr>
+          <w:rStyle w:val="FunctionTok"/>
+        </w:rPr>
+        <w:t xml:space="preserve">c</w:t>
+      </w:r>
+      <w:r>
+        <w:rPr>
+          <w:rStyle w:val="NormalTok"/>
+        </w:rPr>
+        <w:t xml:space="preserve">(id, father, mother), \(x) </w:t>
+      </w:r>
+      <w:r>
+        <w:rPr>
+          <w:rStyle w:val="FunctionTok"/>
+        </w:rPr>
+        <w:t xml:space="preserve">str_remove</w:t>
+      </w:r>
+      <w:r>
+        <w:rPr>
+          <w:rStyle w:val="NormalTok"/>
+        </w:rPr>
+        <w:t xml:space="preserve">(x, </w:t>
+      </w:r>
+      <w:r>
+        <w:rPr>
+          <w:rStyle w:val="StringTok"/>
+        </w:rPr>
+        <w:t xml:space="preserve">"^corpasome_"</w:t>
+      </w:r>
+      <w:r>
+        <w:rPr>
+          <w:rStyle w:val="NormalTok"/>
+        </w:rPr>
+        <w:t xml:space="preserve">)),</w:t>
+      </w:r>
+      <w:r>
+        <w:br/>
+      </w:r>
+      <w:r>
+        <w:rPr>
+          <w:rStyle w:val="NormalTok"/>
+        </w:rPr>
+        <w:t xml:space="preserve">    </w:t>
+      </w:r>
+      <w:r>
+        <w:rPr>
+          <w:rStyle w:val="AttributeTok"/>
+        </w:rPr>
+        <w:t xml:space="preserve">father   =</w:t>
+      </w:r>
+      <w:r>
+        <w:rPr>
+          <w:rStyle w:val="NormalTok"/>
+        </w:rPr>
+        <w:t xml:space="preserve"> </w:t>
+      </w:r>
+      <w:r>
+        <w:rPr>
+          <w:rStyle w:val="FunctionTok"/>
+        </w:rPr>
+        <w:t xml:space="preserve">na_if</w:t>
+      </w:r>
+      <w:r>
+        <w:rPr>
+          <w:rStyle w:val="NormalTok"/>
+        </w:rPr>
+        <w:t xml:space="preserve">(father, </w:t>
+      </w:r>
+      <w:r>
+        <w:rPr>
+          <w:rStyle w:val="StringTok"/>
+        </w:rPr>
+        <w:t xml:space="preserve">"0"</w:t>
+      </w:r>
+      <w:r>
+        <w:rPr>
+          <w:rStyle w:val="NormalTok"/>
+        </w:rPr>
+        <w:t xml:space="preserve">),     </w:t>
+      </w:r>
+      <w:r>
+        <w:rPr>
+          <w:rStyle w:val="CommentTok"/>
+        </w:rPr>
+        <w:t xml:space="preserve"># 0 = no parent in the file -&gt; NA</w:t>
+      </w:r>
+      <w:r>
+        <w:br/>
+      </w:r>
+      <w:r>
+        <w:rPr>
+          <w:rStyle w:val="NormalTok"/>
+        </w:rPr>
+        <w:t xml:space="preserve">         </w:t>
+      </w:r>
+      <w:r>
+        <w:rPr>
+          <w:rStyle w:val="AttributeTok"/>
+        </w:rPr>
+        <w:t xml:space="preserve">mother   =</w:t>
+      </w:r>
+      <w:r>
+        <w:rPr>
+          <w:rStyle w:val="NormalTok"/>
+        </w:rPr>
+        <w:t xml:space="preserve"> </w:t>
+      </w:r>
+      <w:r>
+        <w:rPr>
+          <w:rStyle w:val="FunctionTok"/>
+        </w:rPr>
+        <w:t xml:space="preserve">na_if</w:t>
+      </w:r>
+      <w:r>
+        <w:rPr>
+          <w:rStyle w:val="NormalTok"/>
+        </w:rPr>
+        <w:t xml:space="preserve">(mother, </w:t>
+      </w:r>
+      <w:r>
+        <w:rPr>
+          <w:rStyle w:val="StringTok"/>
+        </w:rPr>
+        <w:t xml:space="preserve">"0"</w:t>
+      </w:r>
+      <w:r>
+        <w:rPr>
+          <w:rStyle w:val="NormalTok"/>
+        </w:rPr>
+        <w:t xml:space="preserve">),</w:t>
+      </w:r>
+      <w:r>
+        <w:br/>
+      </w:r>
+      <w:r>
+        <w:rPr>
+          <w:rStyle w:val="NormalTok"/>
+        </w:rPr>
+        <w:t xml:space="preserve">         </w:t>
+      </w:r>
+      <w:r>
+        <w:rPr>
+          <w:rStyle w:val="AttributeTok"/>
+        </w:rPr>
+        <w:t xml:space="preserve">affected =</w:t>
+      </w:r>
+      <w:r>
+        <w:rPr>
+          <w:rStyle w:val="NormalTok"/>
+        </w:rPr>
+        <w:t xml:space="preserve"> </w:t>
+      </w:r>
+      <w:r>
+        <w:rPr>
+          <w:rStyle w:val="FunctionTok"/>
+        </w:rPr>
+        <w:t xml:space="preserve">as.integer</w:t>
+      </w:r>
+      <w:r>
+        <w:rPr>
+          <w:rStyle w:val="NormalTok"/>
+        </w:rPr>
+        <w:t xml:space="preserve">(phenotype </w:t>
+      </w:r>
+      <w:r>
+        <w:rPr>
+          <w:rStyle w:val="SpecialCharTok"/>
+        </w:rPr>
+        <w:t xml:space="preserve">==</w:t>
+      </w:r>
+      <w:r>
+        <w:rPr>
+          <w:rStyle w:val="NormalTok"/>
+        </w:rPr>
+        <w:t xml:space="preserve"> </w:t>
+      </w:r>
+      <w:r>
+        <w:rPr>
+          <w:rStyle w:val="DecValTok"/>
+        </w:rPr>
+        <w:t xml:space="preserve">2</w:t>
+      </w:r>
+      <w:r>
+        <w:rPr>
+          <w:rStyle w:val="NormalTok"/>
+        </w:rPr>
+        <w:t xml:space="preserve">))  </w:t>
+      </w:r>
+      <w:r>
+        <w:rPr>
+          <w:rStyle w:val="CommentTok"/>
+        </w:rPr>
+        <w:t xml:space="preserve"># 2 = affected -&gt; 1, otherwise 0</w:t>
+      </w:r>
+      <w:r>
+        <w:br/>
+      </w:r>
+      <w:r>
+        <w:br/>
+      </w:r>
+      <w:r>
+        <w:rPr>
+          <w:rStyle w:val="NormalTok"/>
+        </w:rPr>
+        <w:t xml:space="preserve">pedi </w:t>
+      </w:r>
+      <w:r>
+        <w:rPr>
+          <w:rStyle w:val="OtherTok"/>
+        </w:rPr>
+        <w:t xml:space="preserve">&lt;-</w:t>
+      </w:r>
+      <w:r>
+        <w:rPr>
+          <w:rStyle w:val="NormalTok"/>
+        </w:rPr>
+        <w:t xml:space="preserve"> </w:t>
+      </w:r>
+      <w:r>
+        <w:rPr>
+          <w:rStyle w:val="FunctionTok"/>
+        </w:rPr>
+        <w:t xml:space="preserve">pedigree</w:t>
+      </w:r>
+      <w:r>
+        <w:rPr>
+          <w:rStyle w:val="NormalTok"/>
+        </w:rPr>
+        <w:t xml:space="preserve">(</w:t>
+      </w:r>
+      <w:r>
+        <w:rPr>
+          <w:rStyle w:val="AttributeTok"/>
+        </w:rPr>
+        <w:t xml:space="preserve">id      =</w:t>
+      </w:r>
+      <w:r>
+        <w:rPr>
+          <w:rStyle w:val="NormalTok"/>
+        </w:rPr>
+        <w:t xml:space="preserve"> ped2</w:t>
+      </w:r>
+      <w:r>
+        <w:rPr>
+          <w:rStyle w:val="SpecialCharTok"/>
+        </w:rPr>
+        <w:t xml:space="preserve">$</w:t>
+      </w:r>
+      <w:r>
+        <w:rPr>
+          <w:rStyle w:val="NormalTok"/>
+        </w:rPr>
+        <w:t xml:space="preserve">id,</w:t>
+      </w:r>
+      <w:r>
+        <w:br/>
+      </w:r>
+      <w:r>
+        <w:rPr>
+          <w:rStyle w:val="NormalTok"/>
+        </w:rPr>
+        <w:t xml:space="preserve">                 </w:t>
+      </w:r>
+      <w:r>
+        <w:rPr>
+          <w:rStyle w:val="AttributeTok"/>
+        </w:rPr>
+        <w:t xml:space="preserve">dadid   =</w:t>
+      </w:r>
+      <w:r>
+        <w:rPr>
+          <w:rStyle w:val="NormalTok"/>
+        </w:rPr>
+        <w:t xml:space="preserve"> ped2</w:t>
+      </w:r>
+      <w:r>
+        <w:rPr>
+          <w:rStyle w:val="SpecialCharTok"/>
+        </w:rPr>
+        <w:t xml:space="preserve">$</w:t>
+      </w:r>
+      <w:r>
+        <w:rPr>
+          <w:rStyle w:val="NormalTok"/>
+        </w:rPr>
+        <w:t xml:space="preserve">father,</w:t>
+      </w:r>
+      <w:r>
+        <w:br/>
+      </w:r>
+      <w:r>
+        <w:rPr>
+          <w:rStyle w:val="NormalTok"/>
+        </w:rPr>
+        <w:t xml:space="preserve">                 </w:t>
+      </w:r>
+      <w:r>
+        <w:rPr>
+          <w:rStyle w:val="AttributeTok"/>
+        </w:rPr>
+        <w:t xml:space="preserve">momid   =</w:t>
+      </w:r>
+      <w:r>
+        <w:rPr>
+          <w:rStyle w:val="NormalTok"/>
+        </w:rPr>
+        <w:t xml:space="preserve"> ped2</w:t>
+      </w:r>
+      <w:r>
+        <w:rPr>
+          <w:rStyle w:val="SpecialCharTok"/>
+        </w:rPr>
+        <w:t xml:space="preserve">$</w:t>
+      </w:r>
+      <w:r>
+        <w:rPr>
+          <w:rStyle w:val="NormalTok"/>
+        </w:rPr>
+        <w:t xml:space="preserve">mother,</w:t>
+      </w:r>
+      <w:r>
+        <w:br/>
+      </w:r>
+      <w:r>
+        <w:rPr>
+          <w:rStyle w:val="NormalTok"/>
+        </w:rPr>
+        <w:t xml:space="preserve">                 </w:t>
+      </w:r>
+      <w:r>
+        <w:rPr>
+          <w:rStyle w:val="AttributeTok"/>
+        </w:rPr>
+        <w:t xml:space="preserve">sex     =</w:t>
+      </w:r>
+      <w:r>
+        <w:rPr>
+          <w:rStyle w:val="NormalTok"/>
+        </w:rPr>
+        <w:t xml:space="preserve"> ped2</w:t>
+      </w:r>
+      <w:r>
+        <w:rPr>
+          <w:rStyle w:val="SpecialCharTok"/>
+        </w:rPr>
+        <w:t xml:space="preserve">$</w:t>
+      </w:r>
+      <w:r>
+        <w:rPr>
+          <w:rStyle w:val="NormalTok"/>
+        </w:rPr>
+        <w:t xml:space="preserve">sex,          </w:t>
+      </w:r>
+      <w:r>
+        <w:rPr>
+          <w:rStyle w:val="CommentTok"/>
+        </w:rPr>
+        <w:t xml:space="preserve"># 1 = male, 2 = female</w:t>
+      </w:r>
+      <w:r>
+        <w:br/>
+      </w:r>
+      <w:r>
+        <w:rPr>
+          <w:rStyle w:val="NormalTok"/>
+        </w:rPr>
+        <w:t xml:space="preserve">                 </w:t>
+      </w:r>
+      <w:r>
+        <w:rPr>
+          <w:rStyle w:val="AttributeTok"/>
+        </w:rPr>
+        <w:t xml:space="preserve">affected =</w:t>
+      </w:r>
+      <w:r>
+        <w:rPr>
+          <w:rStyle w:val="NormalTok"/>
+        </w:rPr>
+        <w:t xml:space="preserve"> ped2</w:t>
+      </w:r>
+      <w:r>
+        <w:rPr>
+          <w:rStyle w:val="SpecialCharTok"/>
+        </w:rPr>
+        <w:t xml:space="preserve">$</w:t>
+      </w:r>
+      <w:r>
+        <w:rPr>
+          <w:rStyle w:val="NormalTok"/>
+        </w:rPr>
+        <w:t xml:space="preserve">affected)</w:t>
+      </w:r>
+      <w:r>
+        <w:br/>
+      </w:r>
+      <w:r>
+        <w:br/>
+      </w:r>
+      <w:r>
+        <w:rPr>
+          <w:rStyle w:val="FunctionTok"/>
+        </w:rPr>
+        <w:t xml:space="preserve">plot</w:t>
+      </w:r>
+      <w:r>
+        <w:rPr>
+          <w:rStyle w:val="NormalTok"/>
+        </w:rPr>
+        <w:t xml:space="preserve">(pedi)</w:t>
+      </w:r>
+    </w:p>
+    <w:p>
+      <w:pPr>
+        <w:pStyle w:val="FirstParagraph"/>
+      </w:pPr>
+      <w:r>
+        <w:drawing>
+          <wp:inline>
+            <wp:extent cx="5334000" cy="4267200"/>
+            <wp:effectExtent b="0" l="0" r="0" t="0"/>
+            <wp:docPr descr="" title="" id="14" name="Picture"/>
+            <a:graphic>
+              <a:graphicData uri="http://schemas.openxmlformats.org/drawingml/2006/picture">
+                <pic:pic>
+                  <pic:nvPicPr>
+                    <pic:cNvPr descr="report_G5_files/figure-docx/unnamed-chunk-1-1.png" id="15" name="Picture"/>
+                    <pic:cNvPicPr>
+                      <a:picLocks noChangeArrowheads="1" noChangeAspect="1"/>
+                    </pic:cNvPicPr>
+                  </pic:nvPicPr>
+                  <pic:blipFill>
+                    <a:blip r:embed="rId13"/>
+                    <a:stretch>
+                      <a:fillRect/>
+                    </a:stretch>
+                  </pic:blipFill>
+                  <pic:spPr bwMode="auto">
+                    <a:xfrm>
+                      <a:off x="0" y="0"/>
+                      <a:ext cx="5334000" cy="4267200"/>
+                    </a:xfrm>
+                    <a:prstGeom prst="rect">
+                      <a:avLst/>
+                    </a:prstGeom>
+                    <a:noFill/>
+                    <a:ln w="9525">
+                      <a:noFill/>
+                      <a:headEnd/>
+                      <a:tailEnd/>
+                    </a:ln>
+                  </pic:spPr>
+                </pic:pic>
+              </a:graphicData>
+            </a:graphic>
+          </wp:inline>
+        </w:drawing>
+      </w:r>
+    </w:p>
+    <w:bookmarkStart w:id="16" w:name="study-participantswhole-exome-sequencing"/>
     <w:p>
       <w:pPr>
         <w:pStyle w:val="Heading3"/>
@@ -252,7 +1011,10 @@
         <w:t xml:space="preserve">Description of the Corpas family project (</w:t>
       </w:r>
       <w:r>
-        <w:t xml:space="preserve">Corpas et al. (2015)</w:t>
+        <w:rPr>
+          <w:vertAlign w:val="superscript"/>
+        </w:rPr>
+        <w:t xml:space="preserve">1</w:t>
       </w:r>
       <w:r>
         <w:t xml:space="preserve">)</w:t>
@@ -294,8 +1056,8 @@
         <w:t xml:space="preserve">How was the sequencing data generated, on which machine, using which technology, using which sequencing kit, exome array?</w:t>
       </w:r>
     </w:p>
-    <w:bookmarkEnd w:id="13"/>
-    <w:bookmarkStart w:id="14" w:name="ngs-data-preprocessing"/>
+    <w:bookmarkEnd w:id="16"/>
+    <w:bookmarkStart w:id="17" w:name="ngs-data-preprocessing"/>
     <w:p>
       <w:pPr>
         <w:pStyle w:val="Heading3"/>
@@ -376,8 +1138,8 @@
         <w:t xml:space="preserve">Describe the different steps, what are they doing, what is the input/output.</w:t>
       </w:r>
     </w:p>
-    <w:bookmarkEnd w:id="14"/>
-    <w:bookmarkStart w:id="15" w:name="variant-annotation-and-filtering"/>
+    <w:bookmarkEnd w:id="17"/>
+    <w:bookmarkStart w:id="18" w:name="variant-annotation-and-filtering"/>
     <w:p>
       <w:pPr>
         <w:pStyle w:val="Heading3"/>
@@ -446,9 +1208,9 @@
         <w:t xml:space="preserve">What annotations/parameters have been used for filtering down the variants?</w:t>
       </w:r>
     </w:p>
-    <w:bookmarkEnd w:id="15"/>
-    <w:bookmarkEnd w:id="16"/>
-    <w:bookmarkStart w:id="22" w:name="results"/>
+    <w:bookmarkEnd w:id="18"/>
+    <w:bookmarkEnd w:id="19"/>
+    <w:bookmarkStart w:id="25" w:name="results"/>
     <w:p>
       <w:pPr>
         <w:pStyle w:val="Heading2"/>
@@ -457,7 +1219,7 @@
         <w:t xml:space="preserve">Results</w:t>
       </w:r>
     </w:p>
-    <w:bookmarkStart w:id="17" w:name="qc"/>
+    <w:bookmarkStart w:id="20" w:name="qc"/>
     <w:p>
       <w:pPr>
         <w:pStyle w:val="Heading3"/>
@@ -502,8 +1264,8 @@
         <w:t xml:space="preserve">show one read quality metric for all samples in one figure.</w:t>
       </w:r>
     </w:p>
-    <w:bookmarkEnd w:id="17"/>
-    <w:bookmarkStart w:id="18" w:name="sample-processing"/>
+    <w:bookmarkEnd w:id="20"/>
+    <w:bookmarkStart w:id="21" w:name="sample-processing"/>
     <w:p>
       <w:pPr>
         <w:pStyle w:val="Heading3"/>
@@ -524,8 +1286,8 @@
         <w:t xml:space="preserve">Table with read statistics (read numbers for each processing step including total number, after initial mapping, after duplicate removal, etc.). What is the outcome of the NGS workflow?</w:t>
       </w:r>
     </w:p>
-    <w:bookmarkEnd w:id="18"/>
-    <w:bookmarkStart w:id="21" w:name="variant-callingfiltering"/>
+    <w:bookmarkEnd w:id="21"/>
+    <w:bookmarkStart w:id="24" w:name="variant-callingfiltering"/>
     <w:p>
       <w:pPr>
         <w:pStyle w:val="Heading3"/>
@@ -737,7 +1499,7 @@
       <w:r>
         <w:t xml:space="preserve"> </w:t>
       </w:r>
-      <w:hyperlink r:id="rId19">
+      <w:hyperlink r:id="rId22">
         <w:r>
           <w:rPr>
             <w:rStyle w:val="Hyperlink"/>
@@ -790,7 +1552,7 @@
       <w:r>
         <w:t xml:space="preserve"> </w:t>
       </w:r>
-      <w:hyperlink r:id="rId20">
+      <w:hyperlink r:id="rId23">
         <w:r>
           <w:rPr>
             <w:rStyle w:val="Hyperlink"/>
@@ -799,9 +1561,9 @@
         </w:r>
       </w:hyperlink>
     </w:p>
-    <w:bookmarkEnd w:id="21"/>
-    <w:bookmarkEnd w:id="22"/>
-    <w:bookmarkStart w:id="23" w:name="discussion"/>
+    <w:bookmarkEnd w:id="24"/>
+    <w:bookmarkEnd w:id="25"/>
+    <w:bookmarkStart w:id="26" w:name="discussion"/>
     <w:p>
       <w:pPr>
         <w:pStyle w:val="Heading2"/>
@@ -865,8 +1627,8 @@
         <w:t xml:space="preserve">Can you think of experiments that could show that you have found a disease-causing variant?</w:t>
       </w:r>
     </w:p>
-    <w:bookmarkEnd w:id="23"/>
-    <w:bookmarkStart w:id="27" w:name="references"/>
+    <w:bookmarkEnd w:id="26"/>
+    <w:bookmarkStart w:id="30" w:name="references"/>
     <w:p>
       <w:pPr>
         <w:pStyle w:val="Heading2"/>
@@ -875,20 +1637,23 @@
         <w:t xml:space="preserve">References</w:t>
       </w:r>
     </w:p>
-    <w:bookmarkStart w:id="26" w:name="refs"/>
-    <w:bookmarkStart w:id="25" w:name="ref-corpas_crowdsourced_2015"/>
+    <w:bookmarkStart w:id="29" w:name="refs"/>
+    <w:bookmarkStart w:id="28" w:name="ref-corpas_crowdsourced_2015"/>
     <w:p>
       <w:pPr>
         <w:pStyle w:val="Bibliography"/>
       </w:pPr>
       <w:r>
-        <w:t xml:space="preserve">Corpas, Manuel, Willy Valdivia-Granda, Nazareth Torres, et al. 2015.</w:t>
+        <w:t xml:space="preserve">1.</w:t>
       </w:r>
       <w:r>
         <w:t xml:space="preserve"> </w:t>
       </w:r>
       <w:r>
-        <w:t xml:space="preserve">“Crowdsourced Direct-to-Consumer Genomic Analysis of a Family Quartet.”</w:t>
+        <w:t xml:space="preserve">	</w:t>
+      </w:r>
+      <w:r>
+        <w:t xml:space="preserve">Corpas, M., Valdivia-Granda, W., Torres, N., Greshake, B., Coletta, A., Knaus, A., Harrison, A.P., Cariaso, M., Moran, F., Nielsen, F., et al. (2015). Crowdsourced direct-to-consumer genomic analysis of a family quartet. BMC Genomics</w:t>
       </w:r>
       <w:r>
         <w:t xml:space="preserve"> </w:t>
@@ -898,18 +1663,15 @@
           <w:i/>
           <w:iCs/>
         </w:rPr>
-        <w:t xml:space="preserve">BMC Genomics</w:t>
+        <w:t xml:space="preserve">16</w:t>
+      </w:r>
+      <w:r>
+        <w:t xml:space="preserve">, 910.</w:t>
       </w:r>
       <w:r>
         <w:t xml:space="preserve"> </w:t>
       </w:r>
-      <w:r>
-        <w:t xml:space="preserve">16 (1): 910.</w:t>
-      </w:r>
-      <w:r>
-        <w:t xml:space="preserve"> </w:t>
-      </w:r>
-      <w:hyperlink r:id="rId24">
+      <w:hyperlink r:id="rId27">
         <w:r>
           <w:rPr>
             <w:rStyle w:val="Hyperlink"/>
@@ -921,9 +1683,9 @@
         <w:t xml:space="preserve">.</w:t>
       </w:r>
     </w:p>
-    <w:bookmarkEnd w:id="25"/>
-    <w:bookmarkEnd w:id="26"/>
-    <w:bookmarkEnd w:id="27"/>
+    <w:bookmarkEnd w:id="28"/>
+    <w:bookmarkEnd w:id="29"/>
+    <w:bookmarkEnd w:id="30"/>
     <w:sectPr>
       <w:footnotePr>
         <w:numRestart w:val="eachSect"/>

</xml_diff>